<commit_message>
okla: reply-brief INPUT opens the '[i]f' quote as filed (pandoc read the straight quote before a bracket as closing); latex and docx still reported for the ')(' token box (fb-595.54.53)
Co-Authored-By: Claude Opus 5.5 <noreply@anthropic.com>
</commit_message>
<xml_diff>
--- a/courts/tenth-circuit/oklahoma/state/supreme-court/reply-brief/usage/OUTPUT-reply-brief.docx
+++ b/courts/tenth-circuit/oklahoma/state/supreme-court/reply-brief/usage/OUTPUT-reply-brief.docx
@@ -8020,10 +8020,13 @@
         <w:t xml:space="preserve"> </w:t>
       </w:r>
       <w:r>
-        <w:t xml:space="preserve">“has never requested state assumption of jurisdiction. [Citation omitted]. 83 Wash. App. at 767, 924 P.2d at 374. Finally, that court observed that,”</w:t>
-      </w:r>
-      <w:r>
-        <w:t xml:space="preserve">[i]f the dispute involving the contracts arose on the reservation, deferral of the case to the tribal court would be appropriate.” [Citation omitted]. 83 Wash. App. at 768, 924 P.2d at 374. The present case involves a tort claim in Indian Country by a non-Indian against a tribally owned entity operated solely for the benefit of the tribe, not an individual. Consequently, it has no application to this case.</w:t>
+        <w:t xml:space="preserve">“has never requested state assumption of jurisdiction. [Citation omitted]. 83 Wash. App. at 767, 924 P.2d at 374. Finally, that court observed that, “[i]f the dispute involving the contracts arose on the reservation, deferral of the case to the tribal court would be appropriate.”</w:t>
+      </w:r>
+      <w:r>
+        <w:t xml:space="preserve"> </w:t>
+      </w:r>
+      <w:r>
+        <w:t xml:space="preserve">[Citation omitted]. 83 Wash. App. at 768, 924 P.2d at 374. The present case involves a tort claim in Indian Country by a non-Indian against a tribally owned entity operated solely for the benefit of the tribe, not an individual. Consequently, it has no application to this case.</w:t>
       </w:r>
     </w:p>
     <w:p>

</xml_diff>